<commit_message>
Ajuste de S - 2.1
</commit_message>
<xml_diff>
--- a/fuentes/CF02_63110190_DU.docx
+++ b/fuentes/CF02_63110190_DU.docx
@@ -210,7 +210,7 @@
               </wp:anchor>
             </w:drawing>
           </mc:Choice>
-          <mc:Fallback xmlns:a14="http://schemas.microsoft.com/office/drawing/2010/main" xmlns:pic="http://schemas.openxmlformats.org/drawingml/2006/picture" xmlns:adec="http://schemas.microsoft.com/office/drawing/2017/decorative" xmlns:a="http://schemas.openxmlformats.org/drawingml/2006/main">
+          <mc:Fallback xmlns:a="http://schemas.openxmlformats.org/drawingml/2006/main" xmlns:adec="http://schemas.microsoft.com/office/drawing/2017/decorative" xmlns:pic="http://schemas.openxmlformats.org/drawingml/2006/picture" xmlns:a14="http://schemas.microsoft.com/office/drawing/2010/main">
             <w:pict w14:anchorId="75509E97">
               <v:rect id="Rectángulo 3" style="position:absolute;margin-left:-55.7pt;margin-top:26.5pt;width:613.85pt;height:204pt;z-index:-251655168;visibility:visible;mso-wrap-style:square;mso-height-percent:0;mso-wrap-distance-left:9pt;mso-wrap-distance-top:0;mso-wrap-distance-right:9pt;mso-wrap-distance-bottom:0;mso-position-horizontal:absolute;mso-position-horizontal-relative:text;mso-position-vertical:absolute;mso-position-vertical-relative:text;mso-height-percent:0;mso-height-relative:margin;v-text-anchor:middle" alt="&quot;&quot;" o:spid="_x0000_s1026" fillcolor="#00314d" stroked="f" strokeweight="1pt" w14:anchorId="04BF2410" o:gfxdata="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"/>
             </w:pict>
@@ -4755,19 +4755,7 @@
         <w:rPr>
           <w:lang w:val="es-419" w:eastAsia="es-CO"/>
         </w:rPr>
-        <w:t>Los momentos de verdad son aquellos puntos de contacto entre el cliente y la empresa donde se define la percepción que el cliente tiene de la marca o servicio. Estos momentos son clave</w:t>
-      </w:r>
-      <w:r>
-        <w:rPr>
-          <w:lang w:val="es-419" w:eastAsia="es-CO"/>
-        </w:rPr>
-        <w:t>s</w:t>
-      </w:r>
-      <w:r>
-        <w:rPr>
-          <w:lang w:val="es-419" w:eastAsia="es-CO"/>
-        </w:rPr>
-        <w:t xml:space="preserve"> para la construcción de la relación con el cliente y pueden ser tanto positivos como negativos, dependiendo de cómo se manejen</w:t>
+        <w:t>Los momentos de verdad son aquellos puntos de contacto entre el cliente y la empresa donde se define la percepción que el cliente tiene de la marca o servicio. Estos momentos son clave para la construcción de la relación con el cliente y pueden ser tanto positivos como negativos, dependiendo de cómo se manejen</w:t>
       </w:r>
       <w:r>
         <w:rPr>
@@ -7361,25 +7349,15 @@
         </w:rPr>
         <w:t xml:space="preserve">: </w:t>
       </w:r>
-      <w:r>
-        <w:fldChar w:fldCharType="begin"/>
-      </w:r>
-      <w:r>
-        <w:instrText>HYPERLINK "https://www.youtube.com/watch?v=O_uQYV8rZ3k"</w:instrText>
-      </w:r>
-      <w:r>
-        <w:fldChar w:fldCharType="separate"/>
-      </w:r>
-      <w:r>
-        <w:rPr>
-          <w:rStyle w:val="Hipervnculo"/>
-          <w:lang w:val="es-419" w:eastAsia="es-CO"/>
-        </w:rPr>
-        <w:t>https://www.youtube.com/watch?v=O_uQYV8rZ3k</w:t>
-      </w:r>
-      <w:r>
-        <w:fldChar w:fldCharType="end"/>
-      </w:r>
+      <w:hyperlink r:id="rId18" w:history="1">
+        <w:r>
+          <w:rPr>
+            <w:rStyle w:val="Hipervnculo"/>
+            <w:lang w:val="es-419" w:eastAsia="es-CO"/>
+          </w:rPr>
+          <w:t>https://www.youtube.com/watch?v=O_uQYV8rZ3k</w:t>
+        </w:r>
+      </w:hyperlink>
     </w:p>
     <w:p>
       <w:pPr>
@@ -7695,7 +7673,7 @@
                     <pic:cNvPicPr/>
                   </pic:nvPicPr>
                   <pic:blipFill>
-                    <a:blip r:embed="rId18"/>
+                    <a:blip r:embed="rId19"/>
                     <a:stretch>
                       <a:fillRect/>
                     </a:stretch>
@@ -8195,7 +8173,7 @@
                     <pic:cNvPicPr/>
                   </pic:nvPicPr>
                   <pic:blipFill>
-                    <a:blip r:embed="rId19"/>
+                    <a:blip r:embed="rId20"/>
                     <a:stretch>
                       <a:fillRect/>
                     </a:stretch>
@@ -8843,7 +8821,7 @@
                     <pic:cNvPicPr/>
                   </pic:nvPicPr>
                   <pic:blipFill>
-                    <a:blip r:embed="rId20"/>
+                    <a:blip r:embed="rId21"/>
                     <a:stretch>
                       <a:fillRect/>
                     </a:stretch>
@@ -10227,7 +10205,7 @@
                     <pic:cNvPicPr/>
                   </pic:nvPicPr>
                   <pic:blipFill>
-                    <a:blip r:embed="rId21"/>
+                    <a:blip r:embed="rId22"/>
                     <a:stretch>
                       <a:fillRect/>
                     </a:stretch>
@@ -11233,7 +11211,7 @@
                 <w:szCs w:val="28"/>
               </w:rPr>
             </w:pPr>
-            <w:hyperlink r:id="rId22" w:history="1">
+            <w:hyperlink r:id="rId23" w:history="1">
               <w:r>
                 <w:rPr>
                   <w:rStyle w:val="Hipervnculo"/>
@@ -11370,7 +11348,7 @@
                 <w:szCs w:val="28"/>
               </w:rPr>
             </w:pPr>
-            <w:hyperlink r:id="rId23" w:history="1">
+            <w:hyperlink r:id="rId24" w:history="1">
               <w:r>
                 <w:rPr>
                   <w:rStyle w:val="Hipervnculo"/>
@@ -11462,7 +11440,7 @@
           <w:lang w:val="en-US" w:eastAsia="es-CO"/>
         </w:rPr>
       </w:pPr>
-      <w:hyperlink r:id="rId24">
+      <w:hyperlink r:id="rId25">
         <w:r>
           <w:rPr>
             <w:rStyle w:val="Hipervnculo"/>
@@ -11491,7 +11469,7 @@
         </w:rPr>
         <w:t xml:space="preserve">McGraw-Hill. </w:t>
       </w:r>
-      <w:hyperlink r:id="rId25">
+      <w:hyperlink r:id="rId26">
         <w:r>
           <w:rPr>
             <w:rStyle w:val="Hipervnculo"/>
@@ -11522,7 +11500,7 @@
           <w:lang w:eastAsia="es-CO"/>
         </w:rPr>
       </w:pPr>
-      <w:hyperlink r:id="rId26">
+      <w:hyperlink r:id="rId27">
         <w:r>
           <w:rPr>
             <w:rStyle w:val="Hipervnculo"/>
@@ -11566,7 +11544,7 @@
           <w:lang w:val="en-US" w:eastAsia="es-CO"/>
         </w:rPr>
       </w:pPr>
-      <w:hyperlink r:id="rId27">
+      <w:hyperlink r:id="rId28">
         <w:r>
           <w:rPr>
             <w:rStyle w:val="Hipervnculo"/>
@@ -11617,7 +11595,7 @@
         </w:rPr>
         <w:t xml:space="preserve">, 64(1), 12–40. </w:t>
       </w:r>
-      <w:hyperlink r:id="rId28">
+      <w:hyperlink r:id="rId29">
         <w:r>
           <w:rPr>
             <w:rStyle w:val="Hipervnculo"/>
@@ -11663,7 +11641,7 @@
           <w:lang w:eastAsia="es-CO"/>
         </w:rPr>
       </w:pPr>
-      <w:hyperlink r:id="rId29">
+      <w:hyperlink r:id="rId30">
         <w:r>
           <w:rPr>
             <w:rStyle w:val="Hipervnculo"/>
@@ -11709,7 +11687,7 @@
           <w:lang w:val="en-US" w:eastAsia="es-CO"/>
         </w:rPr>
       </w:pPr>
-      <w:hyperlink r:id="rId30">
+      <w:hyperlink r:id="rId31">
         <w:r>
           <w:rPr>
             <w:rStyle w:val="Hipervnculo"/>
@@ -12879,8 +12857,8 @@
       </w:pPr>
     </w:p>
     <w:sectPr>
-      <w:headerReference w:type="default" r:id="rId31"/>
-      <w:footerReference w:type="default" r:id="rId32"/>
+      <w:headerReference w:type="default" r:id="rId32"/>
+      <w:footerReference w:type="default" r:id="rId33"/>
       <w:pgSz w:w="12240" w:h="15840"/>
       <w:pgMar w:top="1701" w:right="1134" w:bottom="1134" w:left="1418" w:header="709" w:footer="737" w:gutter="0"/>
       <w:pgNumType w:start="1"/>
@@ -19932,6 +19910,21 @@
 </file>
 
 <file path=customXml/item2.xml><?xml version="1.0" encoding="utf-8"?>
+<b:Sources xmlns:b="http://schemas.openxmlformats.org/officeDocument/2006/bibliography" xmlns="http://schemas.openxmlformats.org/officeDocument/2006/bibliography" SelectedStyle="\APASixthEditionOfficeOnline.xsl" StyleName="APA" Version="6"/>
+</file>
+
+<file path=customXml/item3.xml><?xml version="1.0" encoding="utf-8"?>
+<p:properties xmlns:p="http://schemas.microsoft.com/office/2006/metadata/properties" xmlns:xsi="http://www.w3.org/2001/XMLSchema-instance" xmlns:pc="http://schemas.microsoft.com/office/infopath/2007/PartnerControls">
+  <documentManagement>
+    <TaxCatchAll xmlns="cb45339b-ced9-4d0d-8f64-77573914d53b" xsi:nil="true"/>
+    <lcf76f155ced4ddcb4097134ff3c332f xmlns="43a3ca16-9c26-4813-b83f-4aec9927b43f">
+      <Terms xmlns="http://schemas.microsoft.com/office/infopath/2007/PartnerControls"/>
+    </lcf76f155ced4ddcb4097134ff3c332f>
+  </documentManagement>
+</p:properties>
+</file>
+
+<file path=customXml/item4.xml><?xml version="1.0" encoding="utf-8"?>
 <ct:contentTypeSchema xmlns:ct="http://schemas.microsoft.com/office/2006/metadata/contentType" xmlns:ma="http://schemas.microsoft.com/office/2006/metadata/properties/metaAttributes" ct:_="" ma:_="" ma:contentTypeName="Documento" ma:contentTypeID="0x01010049282E1EDBE9234EA9E6D38F720E265F" ma:contentTypeVersion="15" ma:contentTypeDescription="Crear nuevo documento." ma:contentTypeScope="" ma:versionID="b31c7aa9eaf043a08b87120b3c4916e3">
   <xsd:schema xmlns:xsd="http://www.w3.org/2001/XMLSchema" xmlns:xs="http://www.w3.org/2001/XMLSchema" xmlns:p="http://schemas.microsoft.com/office/2006/metadata/properties" xmlns:ns2="cb45339b-ced9-4d0d-8f64-77573914d53b" xmlns:ns3="43a3ca16-9c26-4813-b83f-4aec9927b43f" targetNamespace="http://schemas.microsoft.com/office/2006/metadata/properties" ma:root="true" ma:fieldsID="3533d065b04d75c457075bc55f1f5315" ns2:_="" ns3:_="">
     <xsd:import namespace="cb45339b-ced9-4d0d-8f64-77573914d53b"/>
@@ -20166,21 +20159,6 @@
 </ct:contentTypeSchema>
 </file>
 
-<file path=customXml/item3.xml><?xml version="1.0" encoding="utf-8"?>
-<p:properties xmlns:p="http://schemas.microsoft.com/office/2006/metadata/properties" xmlns:xsi="http://www.w3.org/2001/XMLSchema-instance" xmlns:pc="http://schemas.microsoft.com/office/infopath/2007/PartnerControls">
-  <documentManagement>
-    <TaxCatchAll xmlns="cb45339b-ced9-4d0d-8f64-77573914d53b" xsi:nil="true"/>
-    <lcf76f155ced4ddcb4097134ff3c332f xmlns="43a3ca16-9c26-4813-b83f-4aec9927b43f">
-      <Terms xmlns="http://schemas.microsoft.com/office/infopath/2007/PartnerControls"/>
-    </lcf76f155ced4ddcb4097134ff3c332f>
-  </documentManagement>
-</p:properties>
-</file>
-
-<file path=customXml/item4.xml><?xml version="1.0" encoding="utf-8"?>
-<b:Sources xmlns:b="http://schemas.openxmlformats.org/officeDocument/2006/bibliography" xmlns="http://schemas.openxmlformats.org/officeDocument/2006/bibliography" SelectedStyle="\APASixthEditionOfficeOnline.xsl" StyleName="APA" Version="6"/>
-</file>
-
 <file path=customXml/itemProps1.xml><?xml version="1.0" encoding="utf-8"?>
 <ds:datastoreItem xmlns:ds="http://schemas.openxmlformats.org/officeDocument/2006/customXml" ds:itemID="{81CBDEC1-3B00-44ED-AD36-0268077980BA}">
   <ds:schemaRefs>
@@ -20190,6 +20168,25 @@
 </file>
 
 <file path=customXml/itemProps2.xml><?xml version="1.0" encoding="utf-8"?>
+<ds:datastoreItem xmlns:ds="http://schemas.openxmlformats.org/officeDocument/2006/customXml" ds:itemID="{E8AB44A3-7C62-4BD2-82ED-8ABC209970FA}">
+  <ds:schemaRefs>
+    <ds:schemaRef ds:uri="http://schemas.openxmlformats.org/officeDocument/2006/bibliography"/>
+  </ds:schemaRefs>
+</ds:datastoreItem>
+</file>
+
+<file path=customXml/itemProps3.xml><?xml version="1.0" encoding="utf-8"?>
+<ds:datastoreItem xmlns:ds="http://schemas.openxmlformats.org/officeDocument/2006/customXml" ds:itemID="{6929C9FE-9F22-4B98-96EF-1B541B3BD0B2}">
+  <ds:schemaRefs>
+    <ds:schemaRef ds:uri="http://schemas.microsoft.com/office/2006/metadata/properties"/>
+    <ds:schemaRef ds:uri="http://schemas.microsoft.com/office/infopath/2007/PartnerControls"/>
+    <ds:schemaRef ds:uri="cb45339b-ced9-4d0d-8f64-77573914d53b"/>
+    <ds:schemaRef ds:uri="43a3ca16-9c26-4813-b83f-4aec9927b43f"/>
+  </ds:schemaRefs>
+</ds:datastoreItem>
+</file>
+
+<file path=customXml/itemProps4.xml><?xml version="1.0" encoding="utf-8"?>
 <ds:datastoreItem xmlns:ds="http://schemas.openxmlformats.org/officeDocument/2006/customXml" ds:itemID="{DF43E046-DB0C-42D1-8C73-AE38B52F1ED7}">
   <ds:schemaRefs>
     <ds:schemaRef ds:uri="http://schemas.microsoft.com/office/2006/metadata/contentType"/>
@@ -20206,23 +20203,4 @@
     <ds:schemaRef ds:uri="http://schemas.microsoft.com/internal/obd"/>
   </ds:schemaRefs>
 </ds:datastoreItem>
-</file>
-
-<file path=customXml/itemProps3.xml><?xml version="1.0" encoding="utf-8"?>
-<ds:datastoreItem xmlns:ds="http://schemas.openxmlformats.org/officeDocument/2006/customXml" ds:itemID="{6929C9FE-9F22-4B98-96EF-1B541B3BD0B2}">
-  <ds:schemaRefs>
-    <ds:schemaRef ds:uri="http://schemas.microsoft.com/office/2006/metadata/properties"/>
-    <ds:schemaRef ds:uri="http://schemas.microsoft.com/office/infopath/2007/PartnerControls"/>
-    <ds:schemaRef ds:uri="cb45339b-ced9-4d0d-8f64-77573914d53b"/>
-    <ds:schemaRef ds:uri="43a3ca16-9c26-4813-b83f-4aec9927b43f"/>
-  </ds:schemaRefs>
-</ds:datastoreItem>
-</file>
-
-<file path=customXml/itemProps4.xml><?xml version="1.0" encoding="utf-8"?>
-<ds:datastoreItem xmlns:ds="http://schemas.openxmlformats.org/officeDocument/2006/customXml" ds:itemID="{E8AB44A3-7C62-4BD2-82ED-8ABC209970FA}">
-  <ds:schemaRefs>
-    <ds:schemaRef ds:uri="http://schemas.openxmlformats.org/officeDocument/2006/bibliography"/>
-  </ds:schemaRefs>
-</ds:datastoreItem>
 </file>
</xml_diff>